<commit_message>
Rebuild security questionnaire from validated instruments
Replace the researcher-made items with items adapted from three
validated instruments: the Trust and Security scale of Rukhiran et al.
(2023), the CIA Triad and Technology scales of Phakaedam et al. (2026),
and the IM-ISMS of Dominguez Dominguez et al. (2023). Each item is
aligned with an ISO/IEC 27001:2022 Annex A control and a study
objective, and an adaptation matrix records the original and adapted
wording. Manuscript revisions and the defense script are updated to
describe the adapted instrument and its re-validation.

Co-Authored-By: Claude Opus 5.5 <noreply@anthropic.com>
Claude-Session: https://claude.ai/code/session_01NeqS41gKi8124JjYBQKeXi
</commit_message>
<xml_diff>
--- a/docs/manuscript/LSIAMS_ISO27001_Manuscript_Revisions.docx
+++ b/docs/manuscript/LSIAMS_ISO27001_Manuscript_Revisions.docx
@@ -15,7 +15,7 @@
           <w:sz w:val="24"/>
           <w:szCs w:val="24"/>
         </w:rPr>
-        <w:t xml:space="preserve">Manuscript Revisions for the ISO/IEC 27001 Security Questionnaire</w:t>
+        <w:t xml:space="preserve">Manuscript Revisions for the Adapted Security Questionnaire</w:t>
       </w:r>
     </w:p>
     <w:p>
@@ -31,7 +31,7 @@
           <w:sz w:val="24"/>
           <w:szCs w:val="24"/>
         </w:rPr>
-        <w:t xml:space="preserve">L-SIAMS — Chapter III and Appendices</w:t>
+        <w:t xml:space="preserve">L-SIAMS — Chapter III, Appendices and References</w:t>
       </w:r>
     </w:p>
     <w:p>
@@ -45,7 +45,7 @@
           <w:sz w:val="24"/>
           <w:szCs w:val="24"/>
         </w:rPr>
-        <w:t xml:space="preserve">This document lists the changes needed to add the Security Evaluation Questionnaire to the manuscript. Each change shows the current text in gray italics and the revised text below it. Section and table numbers refer to LSIAMS_Manuscript_Revised.docx. The questionnaire itself is in LSIAMS_Security_Questionnaire_ISO27001.docx and goes into the appendices.</w:t>
+        <w:t xml:space="preserve">This document lists the changes needed to add the adapted Security Evaluation Questionnaire to the manuscript. Each change shows the current text in gray italics and the revised text below it. Section and table numbers refer to LSIAMS_Manuscript_Revised.docx. The questionnaire itself is in LSIAMS_Security_Questionnaire_ISO27001.docx and goes into the appendices.</w:t>
       </w:r>
     </w:p>
     <w:p>
@@ -76,7 +76,7 @@
           <w:sz w:val="24"/>
           <w:szCs w:val="24"/>
         </w:rPr>
-        <w:t xml:space="preserve">Update the “Role in the evaluation” column for three rows. The student row does not change: students are not asked to judge security controls they cannot observe, and this also keeps the instrument burden on minors to the short quality form.</w:t>
+        <w:t xml:space="preserve">Update the “Role in the evaluation” column for three rows. The student row does not change: students only tap their cards and cannot observe the security controls, and this keeps the instrument burden on minors to the short quality form.</w:t>
       </w:r>
     </w:p>
     <w:tbl>
@@ -208,6 +208,9 @@
         </w:tc>
       </w:tr>
       <w:tr>
+        <w:trPr>
+          <w:cantSplit/>
+        </w:trPr>
         <w:tc>
           <w:tcPr>
             <w:tcW w:type="dxa" w:w="2200"/>
@@ -312,12 +315,15 @@
                 <w:sz w:val="20"/>
                 <w:szCs w:val="20"/>
               </w:rPr>
-              <w:t xml:space="preserve">Session initiation through fingerprint verification; respondents for perceived system quality and perceived security (Form A)</w:t>
+              <w:t xml:space="preserve">Session initiation through fingerprint verification; respondents for perceived system quality and perceived security (Form A, Sections 1–4)</w:t>
             </w:r>
           </w:p>
         </w:tc>
       </w:tr>
       <w:tr>
+        <w:trPr>
+          <w:cantSplit/>
+        </w:trPr>
         <w:tc>
           <w:tcPr>
             <w:tcW w:type="dxa" w:w="2200"/>
@@ -422,12 +428,15 @@
                 <w:sz w:val="20"/>
                 <w:szCs w:val="20"/>
               </w:rPr>
-              <w:t xml:space="preserve">Monitoring capability, data reliability and decision-making support; respondent for perceived security (Form A)</w:t>
+              <w:t xml:space="preserve">Monitoring capability, data reliability and decision-making support; respondent for perceived security (Form A, Sections 2–4)</w:t>
             </w:r>
           </w:p>
         </w:tc>
       </w:tr>
       <w:tr>
+        <w:trPr>
+          <w:cantSplit/>
+        </w:trPr>
         <w:tc>
           <w:tcPr>
             <w:tcW w:type="dxa" w:w="2200"/>
@@ -602,7 +611,7 @@
           <w:sz w:val="24"/>
           <w:szCs w:val="24"/>
         </w:rPr>
-        <w:t xml:space="preserve">System security will be evaluated against ISO/IEC 27001, guided by the CIA framework of confidentiality, integrity and availability, using two complementary sources of evidence: the results of security testing together with the completeness of the recorded audit and security logs, and a researcher-made security evaluation questionnaire described below.</w:t>
+        <w:t xml:space="preserve">System security will be evaluated against ISO/IEC 27001, guided by the CIA framework of confidentiality, integrity and availability, using two complementary sources of evidence: the results of security testing together with the completeness of the recorded audit and security logs, and an adapted security evaluation questionnaire described below.</w:t>
       </w:r>
     </w:p>
     <w:p>
@@ -619,7 +628,7 @@
           <w:sz w:val="22"/>
           <w:szCs w:val="22"/>
         </w:rPr>
-        <w:t xml:space="preserve">Insert as a new paragraph immediately after it</w:t>
+        <w:t xml:space="preserve">Insert as new paragraphs immediately after it</w:t>
       </w:r>
     </w:p>
     <w:p>
@@ -634,7 +643,22 @@
           <w:sz w:val="24"/>
           <w:szCs w:val="24"/>
         </w:rPr>
-        <w:t xml:space="preserve">The security evaluation questionnaire (Appendix __) is derived from ISO/IEC 27001:2022, whose Annex A lists 93 information security controls in four themes: organizational, people, physical and technological (International Organization for Standardization, 2022). Because the standard is written for an organization’s information security management system rather than for a single application, only the controls implemented by L-SIAMS were selected; controls outside the system boundary, such as personnel screening and supplier management, are excluded. Each selected control is expressed as one or more statements, grouped under confidentiality, integrity and availability, and answered on the five-point Likert scale in Table 3. The instrument has two forms. Form A (12 items) is answered by the teachers and the school administrator and covers the controls a user can observe, such as authentication, role restrictions, session timeout, record accuracy and continuity during network interruption. Form B (24 items) is answered by the IT administrator, who inspects the configuration, logs and test results and records the evidence behind each rating. A traceability matrix in the same appendix links every item to its Annex A control, the L-SIAMS mechanism that implements it, and the security test in Table 7 that provides corroborating technical evidence.</w:t>
+        <w:t xml:space="preserve">The security evaluation questionnaire (Appendix __) was adapted and modified from three published instruments whose validity and reliability were established by their authors. The Trust and Security scale of Rukhiran et al. (2023), developed for biometric examination attendance in higher education (α = .932, CR = .932, AVE = .735), was adapted to measure teachers’ trust in the fingerprint verification that opens an attendance session. The CIA Triad scale of Phakaedam et al. (2026), validated through expert review, pilot testing and confirmatory factor analysis with 540 respondents (confidentiality α = .912, integrity α = .921, availability α = .905), provided the confidentiality, integrity and availability items, together with three items of its Technology scale (α = .833). The Information Security Management System Measurement Instrument (IM-ISMS) of Domínguez Domínguez et al. (2023), whose items are based on ISO/IEC 27002 controls (privacy ω = .892, integrity ω = .936, authenticity ω = .932), provided the items for the technical assessment of the controls.</w:t>
+      </w:r>
+    </w:p>
+    <w:p>
+      <w:pPr>
+        <w:spacing w:after="160" w:before="0" w:line="360"/>
+        <w:ind w:left="360"/>
+        <w:jc w:val="both"/>
+      </w:pPr>
+      <w:r>
+        <w:rPr>
+          <w:rFonts w:ascii="Times New Roman" w:cs="Times New Roman" w:eastAsia="Times New Roman" w:hAnsi="Times New Roman"/>
+          <w:sz w:val="24"/>
+          <w:szCs w:val="24"/>
+        </w:rPr>
+        <w:t xml:space="preserve">The items were adapted in three ways: the context was changed to L-SIAMS; items that described a person’s own security practice were reframed as statements about the protection the system provides; and all items were placed on the five-point agreement scale in Table 3. Each adapted item was then aligned with the ISO/IEC 27001:2022 Annex A control it addresses. Items measuring organizational policy, third-party services, personal knowledge and attitudes, or technology acceptance were not adopted, because they fall outside the security of the system itself. The instrument has two forms. Form A (18 items) is answered by the teachers and the school administrator and covers trust in fingerprint verification (answered by teachers only) and the confidentiality, integrity and availability of the system as users experience it. Form B (19 items) is answered by the IT administrator, who inspects the configuration, logs and test results and records the evidence behind each rating. An item adaptation matrix in the same appendix lists the original and adapted wording of every item with its source.</w:t>
       </w:r>
     </w:p>
     <w:p>
@@ -666,7 +690,7 @@
           <w:sz w:val="24"/>
           <w:szCs w:val="24"/>
         </w:rPr>
-        <w:t xml:space="preserve">Before pilot testing, the content validity of the security questionnaire will be established by three experts in information technology or information security, who will rate the relevance of each item to its Annex A control on a four-point scale. The item-level content validity index (I-CVI) and the scale-level index (S-CVI/Ave) will be computed, and items that do not meet the thresholds of Lynn (1986) and Polit and Beck (2006) will be revised or removed.</w:t>
+        <w:t xml:space="preserve">Because adapting the items changes their wording, respondents and setting, the validity and reliability reported for the source instruments do not transfer automatically. Before pilot testing, three experts in information technology or information security will rate the relevance of each adapted item to its intended construct and control on a four-point scale, and the item-level (I-CVI) and scale-level (S-CVI/Ave) content validity indices will be computed; items that do not meet the thresholds of Lynn (1986) and Polit and Beck (2006) will be revised or removed. The pilot test will then re-establish the reliability of Form A in the present setting.</w:t>
       </w:r>
     </w:p>
     <w:p>
@@ -782,7 +806,7 @@
           <w:sz w:val="24"/>
           <w:szCs w:val="24"/>
         </w:rPr>
-        <w:t xml:space="preserve">Responses to the security evaluation questionnaire will be summarized per item, per CIA pillar and per form using the mean and standard deviation, and each mean will be interpreted using Table 6. Form A and Form B are analyzed separately because they measure different things: Form A captures perceived security from the users’ point of view, while Form B is an evidence-based assessment of the technical controls. Since Form B has a single respondent, its results are reported item by item together with the evidence recorded for each rating and are not treated as a statistical sample. The internal consistency of Form A will be estimated with Cronbach’s alpha using the pilot-test responses, with a value of 0.70 or higher considered acceptable.</w:t>
+        <w:t xml:space="preserve">Responses to the security evaluation questionnaire will be summarized per item and per subscale (trust and security of fingerprint verification, confidentiality, integrity and availability) using the mean and standard deviation, and each mean will be interpreted using Table 6. Form A and Form B are analyzed separately: Form A captures perceived security from the users’ point of view, while Form B is an evidence-based assessment of the technical controls. Since Form B has a single respondent, its results are reported item by item together with the evidence recorded for each rating and are not treated as a statistical sample. The internal consistency of each Form A subscale will be estimated with Cronbach’s alpha using the pilot-test responses, with a value of 0.70 or higher considered acceptable, and compared with the reliability reported for the source instruments.</w:t>
       </w:r>
     </w:p>
     <w:p>
@@ -1044,7 +1068,7 @@
                 <w:sz w:val="20"/>
                 <w:szCs w:val="20"/>
               </w:rPr>
-              <w:t xml:space="preserve">Security evaluation questionnaire (ISO/IEC 27001:2022 Annex A)</w:t>
+              <w:t xml:space="preserve">Adapted security evaluation questionnaire aligned with ISO/IEC 27001:2022</w:t>
             </w:r>
           </w:p>
         </w:tc>
@@ -1108,7 +1132,7 @@
                 <w:sz w:val="20"/>
                 <w:szCs w:val="20"/>
               </w:rPr>
-              <w:t xml:space="preserve">Mean ≥ 3.40 (High) for each CIA pillar</w:t>
+              <w:t xml:space="preserve">Mean ≥ 3.40 (High) for each subscale</w:t>
             </w:r>
           </w:p>
         </w:tc>
@@ -1161,7 +1185,7 @@
           <w:sz w:val="24"/>
           <w:szCs w:val="24"/>
         </w:rPr>
-        <w:t xml:space="preserve">The same three pillars structure the security evaluation questionnaire, whose items are traced to specific Annex A controls, so that each questionnaire result can be read against the technical evidence for the same control. The success criterion for the questionnaire is a mean of 3.40 or above (High) for each pillar, consistent with the criterion for perceived system quality. The study applies ISO/IEC 27001 as a guiding framework for selecting and evaluating controls at the level of confidentiality, integrity and availability; it does not claim certification or full compliance with the standard, which applies to an organization’s information security management system as a whole.</w:t>
+        <w:t xml:space="preserve">The same three pillars structure the security evaluation questionnaire, whose adapted items are aligned with specific Annex A controls, so that each questionnaire result can be read against the technical evidence for the same control. The success criterion for the questionnaire is a mean of 3.40 or above (High) for each subscale, consistent with the criterion for perceived system quality. The study applies ISO/IEC 27001 as a guiding framework for selecting and evaluating controls at the level of confidentiality, integrity and availability; it does not claim certification or full compliance with the standard, which applies to an organization’s information security management system as a whole.</w:t>
       </w:r>
     </w:p>
     <w:p>
@@ -1178,12 +1202,30 @@
           <w:sz w:val="24"/>
           <w:szCs w:val="24"/>
         </w:rPr>
-        <w:t xml:space="preserve">6. Appendices</w:t>
+        <w:t xml:space="preserve">6. Scope and Limitations (Chapter I)</w:t>
+      </w:r>
+    </w:p>
+    <w:p>
+      <w:pPr>
+        <w:keepNext/>
+        <w:spacing w:after="60" w:before="120" w:line="276"/>
+        <w:jc w:val="both"/>
+      </w:pPr>
+      <w:r>
+        <w:rPr>
+          <w:rFonts w:ascii="Times New Roman" w:cs="Times New Roman" w:eastAsia="Times New Roman" w:hAnsi="Times New Roman"/>
+          <w:b/>
+          <w:bCs/>
+          <w:sz w:val="22"/>
+          <w:szCs w:val="22"/>
+        </w:rPr>
+        <w:t xml:space="preserve">Add at the end of the paragraph on evaluation limitations (the one beginning “Security testing will be conducted through controlled procedures…”)</w:t>
       </w:r>
     </w:p>
     <w:p>
       <w:pPr>
         <w:spacing w:after="160" w:before="0" w:line="360"/>
+        <w:ind w:left="360"/>
         <w:jc w:val="both"/>
       </w:pPr>
       <w:r>
@@ -1192,7 +1234,7 @@
           <w:sz w:val="24"/>
           <w:szCs w:val="24"/>
         </w:rPr>
-        <w:t xml:space="preserve">Add the security evaluation questionnaire as a new appendix, placed after the system-quality questionnaire, and replace every “Appendix __” in this document and in the questionnaire with its letter. The appendix contains the respondent letter and instructions, Form A, Form B, the traceability matrix, the scoring guide and the content validity rating sheet.</w:t>
+        <w:t xml:space="preserve">The security questionnaire is adapted from instruments validated with university students and staff in other countries; its validity and reliability are re-established for this study through expert review and pilot testing, but its results describe the perceptions of the respondents at the study site.</w:t>
       </w:r>
     </w:p>
     <w:p>
@@ -1209,7 +1251,38 @@
           <w:sz w:val="24"/>
           <w:szCs w:val="24"/>
         </w:rPr>
-        <w:t xml:space="preserve">7. References</w:t>
+        <w:t xml:space="preserve">7. Appendices</w:t>
+      </w:r>
+    </w:p>
+    <w:p>
+      <w:pPr>
+        <w:spacing w:after="160" w:before="0" w:line="360"/>
+        <w:jc w:val="both"/>
+      </w:pPr>
+      <w:r>
+        <w:rPr>
+          <w:rFonts w:ascii="Times New Roman" w:cs="Times New Roman" w:eastAsia="Times New Roman" w:hAnsi="Times New Roman"/>
+          <w:sz w:val="24"/>
+          <w:szCs w:val="24"/>
+        </w:rPr>
+        <w:t xml:space="preserve">Add the security evaluation questionnaire as a new appendix, placed after the system-quality questionnaire, and replace every “Appendix __” in this document and in the questionnaire with its letter. The appendix contains the respondent letter and instructions, Form A, Form B, the sources of the adapted items, the item adaptation matrix, the scoring guide and the content validity rating sheet.</w:t>
+      </w:r>
+    </w:p>
+    <w:p>
+      <w:pPr>
+        <w:keepNext/>
+        <w:spacing w:after="120" w:before="360" w:line="276"/>
+        <w:jc w:val="left"/>
+      </w:pPr>
+      <w:r>
+        <w:rPr>
+          <w:rFonts w:ascii="Times New Roman" w:cs="Times New Roman" w:eastAsia="Times New Roman" w:hAnsi="Times New Roman"/>
+          <w:b/>
+          <w:bCs/>
+          <w:sz w:val="24"/>
+          <w:szCs w:val="24"/>
+        </w:rPr>
+        <w:t xml:space="preserve">8. References</w:t>
       </w:r>
     </w:p>
     <w:p>
@@ -1238,7 +1311,7 @@
           <w:sz w:val="24"/>
           <w:szCs w:val="24"/>
         </w:rPr>
-        <w:t xml:space="preserve">International Organization for Standardization. (2022). </w:t>
+        <w:t xml:space="preserve">Domínguez Domínguez, R., Flores Laguna, O., &amp; Sánchez-Valdez, J. A. (2023). </w:t>
       </w:r>
       <w:r>
         <w:rPr>
@@ -1248,15 +1321,15 @@
           <w:sz w:val="24"/>
           <w:szCs w:val="24"/>
         </w:rPr>
-        <w:t xml:space="preserve">ISO/IEC 27002:2022 Information security, cybersecurity and privacy protection — Information security controls</w:t>
-      </w:r>
-      <w:r>
-        <w:rPr>
-          <w:rFonts w:ascii="Times New Roman" w:cs="Times New Roman" w:eastAsia="Times New Roman" w:hAnsi="Times New Roman"/>
-          <w:sz w:val="24"/>
-          <w:szCs w:val="24"/>
-        </w:rPr>
-        <w:t xml:space="preserve">. https://www.iso.org/standard/75652.html</w:t>
+        <w:t xml:space="preserve">Exploratory analysis of a measurement scale of an information security management system</w:t>
+      </w:r>
+      <w:r>
+        <w:rPr>
+          <w:rFonts w:ascii="Times New Roman" w:cs="Times New Roman" w:eastAsia="Times New Roman" w:hAnsi="Times New Roman"/>
+          <w:sz w:val="24"/>
+          <w:szCs w:val="24"/>
+        </w:rPr>
+        <w:t xml:space="preserve"> (arXiv:2306.07367). arXiv. https://doi.org/10.48550/arXiv.2306.07367</w:t>
       </w:r>
     </w:p>
     <w:p>
@@ -1271,7 +1344,7 @@
           <w:sz w:val="24"/>
           <w:szCs w:val="24"/>
         </w:rPr>
-        <w:t xml:space="preserve">Lynn, M. R. (1986). Determination and quantification of content validity. </w:t>
+        <w:t xml:space="preserve">International Organization for Standardization. (2022). </w:t>
       </w:r>
       <w:r>
         <w:rPr>
@@ -1281,15 +1354,15 @@
           <w:sz w:val="24"/>
           <w:szCs w:val="24"/>
         </w:rPr>
-        <w:t xml:space="preserve">Nursing Research, 35</w:t>
-      </w:r>
-      <w:r>
-        <w:rPr>
-          <w:rFonts w:ascii="Times New Roman" w:cs="Times New Roman" w:eastAsia="Times New Roman" w:hAnsi="Times New Roman"/>
-          <w:sz w:val="24"/>
-          <w:szCs w:val="24"/>
-        </w:rPr>
-        <w:t xml:space="preserve">(6), 382–385.</w:t>
+        <w:t xml:space="preserve">ISO/IEC 27002:2022 Information security, cybersecurity and privacy protection — Information security controls</w:t>
+      </w:r>
+      <w:r>
+        <w:rPr>
+          <w:rFonts w:ascii="Times New Roman" w:cs="Times New Roman" w:eastAsia="Times New Roman" w:hAnsi="Times New Roman"/>
+          <w:sz w:val="24"/>
+          <w:szCs w:val="24"/>
+        </w:rPr>
+        <w:t xml:space="preserve">. https://www.iso.org/standard/75652.html</w:t>
       </w:r>
     </w:p>
     <w:p>
@@ -1304,7 +1377,7 @@
           <w:sz w:val="24"/>
           <w:szCs w:val="24"/>
         </w:rPr>
-        <w:t xml:space="preserve">Polit, D. F., &amp; Beck, C. T. (2006). The content validity index: Are you sure you know what’s being reported? Critique and recommendations. </w:t>
+        <w:t xml:space="preserve">Lynn, M. R. (1986). Determination and quantification of content validity. </w:t>
       </w:r>
       <w:r>
         <w:rPr>
@@ -1314,6 +1387,72 @@
           <w:sz w:val="24"/>
           <w:szCs w:val="24"/>
         </w:rPr>
+        <w:t xml:space="preserve">Nursing Research, 35</w:t>
+      </w:r>
+      <w:r>
+        <w:rPr>
+          <w:rFonts w:ascii="Times New Roman" w:cs="Times New Roman" w:eastAsia="Times New Roman" w:hAnsi="Times New Roman"/>
+          <w:sz w:val="24"/>
+          <w:szCs w:val="24"/>
+        </w:rPr>
+        <w:t xml:space="preserve">(6), 382–385.</w:t>
+      </w:r>
+    </w:p>
+    <w:p>
+      <w:pPr>
+        <w:spacing w:after="160" w:before="0" w:line="360"/>
+        <w:ind w:left="720" w:hanging="720"/>
+        <w:jc w:val="left"/>
+      </w:pPr>
+      <w:r>
+        <w:rPr>
+          <w:rFonts w:ascii="Times New Roman" w:cs="Times New Roman" w:eastAsia="Times New Roman" w:hAnsi="Times New Roman"/>
+          <w:sz w:val="24"/>
+          <w:szCs w:val="24"/>
+        </w:rPr>
+        <w:t xml:space="preserve">Phakaedam, C., Savithi, C., &amp; Suttidee, A. (2026). Behavioral and cognitive pathways to information security outcomes in smart universities. </w:t>
+      </w:r>
+      <w:r>
+        <w:rPr>
+          <w:rFonts w:ascii="Times New Roman" w:cs="Times New Roman" w:eastAsia="Times New Roman" w:hAnsi="Times New Roman"/>
+          <w:i/>
+          <w:iCs/>
+          <w:sz w:val="24"/>
+          <w:szCs w:val="24"/>
+        </w:rPr>
+        <w:t xml:space="preserve">Data, 11</w:t>
+      </w:r>
+      <w:r>
+        <w:rPr>
+          <w:rFonts w:ascii="Times New Roman" w:cs="Times New Roman" w:eastAsia="Times New Roman" w:hAnsi="Times New Roman"/>
+          <w:sz w:val="24"/>
+          <w:szCs w:val="24"/>
+        </w:rPr>
+        <w:t xml:space="preserve">(3), 46. https://doi.org/10.3390/data11030046</w:t>
+      </w:r>
+    </w:p>
+    <w:p>
+      <w:pPr>
+        <w:spacing w:after="160" w:before="0" w:line="360"/>
+        <w:ind w:left="720" w:hanging="720"/>
+        <w:jc w:val="left"/>
+      </w:pPr>
+      <w:r>
+        <w:rPr>
+          <w:rFonts w:ascii="Times New Roman" w:cs="Times New Roman" w:eastAsia="Times New Roman" w:hAnsi="Times New Roman"/>
+          <w:sz w:val="24"/>
+          <w:szCs w:val="24"/>
+        </w:rPr>
+        <w:t xml:space="preserve">Polit, D. F., &amp; Beck, C. T. (2006). The content validity index: Are you sure you know what’s being reported? Critique and recommendations. </w:t>
+      </w:r>
+      <w:r>
+        <w:rPr>
+          <w:rFonts w:ascii="Times New Roman" w:cs="Times New Roman" w:eastAsia="Times New Roman" w:hAnsi="Times New Roman"/>
+          <w:i/>
+          <w:iCs/>
+          <w:sz w:val="24"/>
+          <w:szCs w:val="24"/>
+        </w:rPr>
         <w:t xml:space="preserve">Research in Nursing &amp; Health, 29</w:t>
       </w:r>
       <w:r>
@@ -1323,6 +1462,39 @@
           <w:szCs w:val="24"/>
         </w:rPr>
         <w:t xml:space="preserve">(5), 489–497.</w:t>
+      </w:r>
+    </w:p>
+    <w:p>
+      <w:pPr>
+        <w:spacing w:after="160" w:before="0" w:line="360"/>
+        <w:ind w:left="720" w:hanging="720"/>
+        <w:jc w:val="left"/>
+      </w:pPr>
+      <w:r>
+        <w:rPr>
+          <w:rFonts w:ascii="Times New Roman" w:cs="Times New Roman" w:eastAsia="Times New Roman" w:hAnsi="Times New Roman"/>
+          <w:sz w:val="24"/>
+          <w:szCs w:val="24"/>
+        </w:rPr>
+        <w:t xml:space="preserve">Rukhiran, M., Wong-In, S., &amp; Netinant, P. (2023). User acceptance factors related to biometric recognition technologies of examination attendance in higher education: TAM model. </w:t>
+      </w:r>
+      <w:r>
+        <w:rPr>
+          <w:rFonts w:ascii="Times New Roman" w:cs="Times New Roman" w:eastAsia="Times New Roman" w:hAnsi="Times New Roman"/>
+          <w:i/>
+          <w:iCs/>
+          <w:sz w:val="24"/>
+          <w:szCs w:val="24"/>
+        </w:rPr>
+        <w:t xml:space="preserve">Sustainability, 15</w:t>
+      </w:r>
+      <w:r>
+        <w:rPr>
+          <w:rFonts w:ascii="Times New Roman" w:cs="Times New Roman" w:eastAsia="Times New Roman" w:hAnsi="Times New Roman"/>
+          <w:sz w:val="24"/>
+          <w:szCs w:val="24"/>
+        </w:rPr>
+        <w:t xml:space="preserve">(4), 3092. https://doi.org/10.3390/su15043092</w:t>
       </w:r>
     </w:p>
     <w:sectPr>

</xml_diff>

<commit_message>
Recreate security questionnaire forms in the respondent format
Split the questionnaire into two respondent-ready forms laid out like
the sample evaluation forms: Form A for the teachers and school
administrator and Form B for the IT administrator, each with the
researchers' letter, rating legend, profile, CIA-grouped indicator
tables and comment section. Item wording is simplified for
non-technical respondents while keeping the source mapping. The former
appendix becomes the instrument development guide, and the manuscript
revisions and defense script are updated to match.

Co-Authored-By: Claude Opus 5.5 <noreply@anthropic.com>
Claude-Session: https://claude.ai/code/session_01NeqS41gKi8124JjYBQKeXi
</commit_message>
<xml_diff>
--- a/docs/manuscript/LSIAMS_ISO27001_Manuscript_Revisions.docx
+++ b/docs/manuscript/LSIAMS_ISO27001_Manuscript_Revisions.docx
@@ -315,7 +315,7 @@
                 <w:sz w:val="20"/>
                 <w:szCs w:val="20"/>
               </w:rPr>
-              <w:t xml:space="preserve">Session initiation through fingerprint verification; respondents for perceived system quality and perceived security (Form A, Sections 1–4)</w:t>
+              <w:t xml:space="preserve">Session initiation through fingerprint verification; respondents for perceived system quality and perceived security (Form A, Parts A–D)</w:t>
             </w:r>
           </w:p>
         </w:tc>
@@ -428,7 +428,7 @@
                 <w:sz w:val="20"/>
                 <w:szCs w:val="20"/>
               </w:rPr>
-              <w:t xml:space="preserve">Monitoring capability, data reliability and decision-making support; respondent for perceived security (Form A, Sections 2–4)</w:t>
+              <w:t xml:space="preserve">Monitoring capability, data reliability and decision-making support; respondent for perceived security (Form A, Parts B–D)</w:t>
             </w:r>
           </w:p>
         </w:tc>
@@ -1265,7 +1265,7 @@
           <w:sz w:val="24"/>
           <w:szCs w:val="24"/>
         </w:rPr>
-        <w:t xml:space="preserve">Add the security evaluation questionnaire as a new appendix, placed after the system-quality questionnaire, and replace every “Appendix __” in this document and in the questionnaire with its letter. The appendix contains the respondent letter and instructions, Form A, Form B, the sources of the adapted items, the item adaptation matrix, the scoring guide and the content validity rating sheet.</w:t>
+        <w:t xml:space="preserve">Add the security evaluation questionnaire as a new appendix, placed after the system-quality questionnaire, and replace every “Appendix __” in this document and in the questionnaire with its letter. The appendix contains Form A (Teachers and School Administrator), Form B (IT Administrator) and the Instrument Development Guide, which holds the sources of the adapted items, the item adaptation matrix, the scoring guide and the content validity rating sheet.</w:t>
       </w:r>
     </w:p>
     <w:p>

</xml_diff>